<commit_message>
Add missing Scruggs reference; generic redaction note
</commit_message>
<xml_diff>
--- a/files/ESQUIVEL-G-SPED854-M8-PHILOSOPHY-FINAL.docx
+++ b/files/ESQUIVEL-G-SPED854-M8-PHILOSOPHY-FINAL.docx
@@ -552,6 +552,18 @@
     </w:p>
     <w:p/>
     <w:p/>
+    <w:p>
+      <w:pPr>
+        <w:spacing w:after="160"/>
+        <w:ind w:left="720" w:hanging="720"/>
+      </w:pPr>
+      <w:r>
+        <w:rPr>
+          <w:sz w:val="22"/>
+        </w:rPr>
+        <w:t>Scruggs, T. E., Mastropieri, M. A., &amp; McDuffie, K. A. (2007). Co-teaching in inclusive classrooms: A metasynthesis of qualitative research. Exceptional Children, 73(4), 392–416.</w:t>
+      </w:r>
+    </w:p>
     <w:sectPr>
       <w:pgSz w:w="12240" w:h="15840"/>
       <w:pgMar w:top="1440" w:right="1440" w:bottom="1440" w:left="1440" w:header="720" w:footer="720" w:gutter="0"/>

</xml_diff>